<commit_message>
Make Facility Name required in AHFacStat.
</commit_message>
<xml_diff>
--- a/AHFacStat/Allied_Health_Status_Report_v20260418.docx
+++ b/AHFacStat/Allied_Health_Status_Report_v20260418.docx
@@ -1221,7 +1221,20 @@
               <w:rPr>
                 <w:b/>
               </w:rPr>
-              <w:t>21. Facility Name:</w:t>
+              <w:t xml:space="preserve">21. </w:t>
+            </w:r>
+            <w:r>
+              <w:rPr>
+                <w:b/>
+                <w:u w:val="single"/>
+              </w:rPr>
+              <w:t>Facility Name</w:t>
+            </w:r>
+            <w:r>
+              <w:rPr>
+                <w:b/>
+              </w:rPr>
+              <w:t>:</w:t>
             </w:r>
           </w:p>
         </w:tc>

</xml_diff>

<commit_message>
Add form version numbers to titles.
</commit_message>
<xml_diff>
--- a/AHFacStat/Allied_Health_Status_Report_v20260418.docx
+++ b/AHFacStat/Allied_Health_Status_Report_v20260418.docx
@@ -70,6 +70,14 @@
                 <w:szCs w:val="28"/>
               </w:rPr>
               <w:t xml:space="preserve"> Status Report</w:t>
+            </w:r>
+            <w:r>
+              <w:rPr>
+                <w:b/>
+                <w:sz w:val="28"/>
+                <w:szCs w:val="28"/>
+              </w:rPr>
+              <w:t xml:space="preserve"> 3.0</w:t>
             </w:r>
             <w:r>
               <w:rPr>

</xml_diff>